<commit_message>
Automatic update of files.
</commit_message>
<xml_diff>
--- a/fåglar/A 39168-2026 prioriterade fågelarter.docx
+++ b/fåglar/A 39168-2026 prioriterade fågelarter.docx
@@ -82,13 +82,13 @@
         <w:t xml:space="preserve"> av </w:t>
       </w:r>
       <w:r>
-        <w:t>spillkråka</w:t>
+        <w:t>duvhök och spillkråka</w:t>
       </w:r>
       <w:r>
         <w:t xml:space="preserve">. </w:t>
       </w:r>
       <w:r>
-        <w:t>Detta är en prioriterad art</w:t>
+        <w:t>Dessa är prioriterade arter</w:t>
       </w:r>
       <w:r>
         <w:rPr>
@@ -118,7 +118,7 @@
         <w:t xml:space="preserve"> för hänsyn till</w:t>
       </w:r>
       <w:r>
-        <w:t xml:space="preserve"> denna art</w:t>
+        <w:t xml:space="preserve"> dessa arter</w:t>
       </w:r>
       <w:r>
         <w:t>.</w:t>
@@ -130,7 +130,7 @@
         <w:t>Det avverkningsanmälda området hyser miljöer lämpliga för</w:t>
       </w:r>
       <w:r>
-        <w:t xml:space="preserve"> arten</w:t>
+        <w:t xml:space="preserve"> arterna</w:t>
       </w:r>
       <w:r>
         <w:t>.</w:t>
@@ -217,7 +217,7 @@
           <w:rFonts w:asciiTheme="minorHAnsi" w:hAnsiTheme="minorHAnsi" w:cstheme="minorBidi"/>
           <w:lang w:eastAsia="en-US"/>
         </w:rPr>
-        <w:t>spillkråka</w:t>
+        <w:t>duvhök och spillkråka</w:t>
       </w:r>
       <w:r>
         <w:rPr>
@@ -519,7 +519,7 @@
     <w:p/>
     <w:p>
       <w:r>
-        <w:t>2026-10-24</w:t>
+        <w:t>2026-10-25</w:t>
       </w:r>
       <w:r>
         <w:t xml:space="preserve"> </w:t>

</xml_diff>